<commit_message>
V28 Handoff updated: adds Priority 2 — conjoined master document
Added Priority 2: build complete conjoined master document
containing full derivation chain from original primitives
(A1, A2, A3, FP) through V28 current state in one auditable file.

Requires reading historical masters V17-V28 from GitHub before
writing. Not a derivation task — a documentation task.
Build carefully before external submission goes out.
</commit_message>
<xml_diff>
--- a/V4/Logosfield_V4_Handoff_V28.docx
+++ b/V4/Logosfield_V4_Handoff_V28.docx
@@ -88,7 +88,7 @@
           <w:sz w:val="22"/>
           <w:szCs w:val="22"/>
         </w:rPr>
-        <w:t xml:space="preserve">Read Part 21 (V28 results) first. Then this handoff.</w:t>
+        <w:t xml:space="preserve">Read Part 21 (V28 results) first. Then this handoff in full.</w:t>
       </w:r>
     </w:p>
     <w:p>
@@ -122,7 +122,7 @@
           <w:sz w:val="22"/>
           <w:szCs w:val="22"/>
         </w:rPr>
-        <w:t xml:space="preserve">Fix External_Review_Submission_V26.md: remove all sprinkling language. Replace with correct framing: V4 produces Minkowski statistics from pregeometric self-consistency. V4 is NOT a Minkowski sprinkling. Then submit PATH2-L1 to the causal set theory community. This has been deferred too long.</w:t>
+        <w:t xml:space="preserve">Fix External_Review_Submission_V26.md: remove all sprinkling language. Replace with correct framing — V4 produces Minkowski statistics from pregeometric self-consistency. V4 is NOT a Minkowski sprinkling. After correction: submit PATH2-L1 to the causal set theory community. This cannot be deferred further.</w:t>
       </w:r>
     </w:p>
     <w:p>
@@ -331,31 +331,7 @@
           <w:sz w:val="22"/>
           <w:szCs w:val="22"/>
         </w:rPr>
-        <w:t xml:space="preserve">Resolution of 1/k! discrepancy: N_k counts unordered subsets; C_k(Minkowski) is a probability. Comparing like with like (probabilities) gives exact match. The 1/k! was a category error, not a structural mismatch.</w:t>
-      </w:r>
-    </w:p>
-    <w:p>
-      <w:pPr>
-        <w:spacing w:after="100"/>
-      </w:pPr>
-      <w:r>
-        <w:rPr>
-          <w:sz w:val="22"/>
-          <w:szCs w:val="22"/>
-        </w:rPr>
-        <w:t xml:space="preserve">Multiplicativity from A2 transitivity + Poisson independence. Corrections O(exp(−2β)) ≈ 3.5×10⁻⁶.</w:t>
-      </w:r>
-    </w:p>
-    <w:p>
-      <w:pPr>
-        <w:spacing w:after="100"/>
-      </w:pPr>
-      <w:r>
-        <w:rPr>
-          <w:sz w:val="22"/>
-          <w:szCs w:val="22"/>
-        </w:rPr>
-        <w:t xml:space="preserve">Conditional on ρ=24/π (HV).</w:t>
+        <w:t xml:space="preserve">The 1/k! discrepancy was a category error — N_k counts unordered subsets, C_k(Minkowski) is a probability. Comparing like with like (probabilities) gives exact match. Multiplicativity from A2 transitivity + Poisson independence. Corrections O(exp(−2β)) ≈ 3.5×10⁻⁶. Conditional on ρ=24/π (HV).</w:t>
       </w:r>
     </w:p>
     <w:p>
@@ -384,7 +360,7 @@
           <w:sz w:val="22"/>
           <w:szCs w:val="22"/>
         </w:rPr>
-        <w:t xml:space="preserve">L1 [DERIVED]. L2 [IDENTIFIED — HV conditional]. L3 [IDENTIFIED — HV conditional].</w:t>
+        <w:t xml:space="preserve">L1 [DERIVED — V24]. L2 [IDENTIFIED — HV conditional — V26]. L3 [IDENTIFIED — HV conditional — V28].</w:t>
       </w:r>
     </w:p>
     <w:p>
@@ -434,7 +410,7 @@
           <w:sz w:val="22"/>
           <w:szCs w:val="22"/>
         </w:rPr>
-        <w:t xml:space="preserve">Remove sprinkling language from External_Review_Submission_V26.md. V4 produces Minkowski statistics from self-consistency — it does not sprinkle into pre-existing spacetime. After correction: submit PATH2-L1 to causal set theory community immediately. This cannot be deferred further.</w:t>
+        <w:t xml:space="preserve">Remove sprinkling language from submission document. V4 produces Minkowski statistics from self-consistency — it does not sprinkle into pre-existing spacetime. After correction: submit PATH2-L1 immediately.</w:t>
       </w:r>
     </w:p>
     <w:p>
@@ -451,91 +427,105 @@
         <w:spacing w:after="80" w:before="240"/>
       </w:pPr>
       <w:r>
-        <w:t xml:space="preserve">Priority 2 — HV: The Hauptvermutung</w:t>
-      </w:r>
-    </w:p>
-    <w:p>
-      <w:pPr>
-        <w:spacing w:after="100"/>
-      </w:pPr>
-      <w:r>
-        <w:rPr>
-          <w:sz w:val="22"/>
-          <w:szCs w:val="22"/>
-        </w:rPr>
-        <w:t xml:space="preserve">This is the primary mathematical target going forward. HV requires showing V4's causal set IS the Minkowski Poisson sprinkling — not just consistent with it, but equivalent in the full causal order sense.</w:t>
-      </w:r>
-    </w:p>
-    <w:p>
-      <w:pPr>
-        <w:spacing w:after="100"/>
-      </w:pPr>
-      <w:r>
-        <w:rPr>
-          <w:sz w:val="22"/>
-          <w:szCs w:val="22"/>
-        </w:rPr>
-        <w:t xml:space="preserve">Attempt fresh, without accumulated session momentum. The handoff is the anchor. Start from the precise gap: Layer 3 shows chain probabilities match. What remains is showing the complete causal order structure — all n-point functions, not just pairwise and k-chain — is equivalent to Minkowski.</w:t>
-      </w:r>
-    </w:p>
-    <w:p>
-      <w:pPr>
-        <w:spacing w:after="100"/>
-      </w:pPr>
-      <w:r>
-        <w:rPr>
-          <w:sz w:val="22"/>
-          <w:szCs w:val="22"/>
-        </w:rPr>
-        <w:t xml:space="preserve">Approach options to assess at V29 open:</w:t>
-      </w:r>
-    </w:p>
-    <w:p>
-      <w:pPr>
-        <w:spacing w:after="100"/>
-      </w:pPr>
-      <w:r>
-        <w:rPr>
-          <w:sz w:val="22"/>
-          <w:szCs w:val="22"/>
-        </w:rPr>
-        <w:t xml:space="preserve">Option 1: Constructive — show V4's partial order, with all derived constraints applied, admits a unique embedding in Minkowski up to diffeomorphism.</w:t>
-      </w:r>
-    </w:p>
-    <w:p>
-      <w:pPr>
-        <w:spacing w:after="100"/>
-      </w:pPr>
-      <w:r>
-        <w:rPr>
-          <w:sz w:val="22"/>
-          <w:szCs w:val="22"/>
-        </w:rPr>
-        <w:t xml:space="preserve">Option 2: Completeness — show no causal set other than the Minkowski Poisson sprinkling satisfies all V4 constraints simultaneously (A1-A3+FP+derived results).</w:t>
-      </w:r>
-    </w:p>
-    <w:p>
-      <w:pPr>
-        <w:spacing w:after="100"/>
-      </w:pPr>
-      <w:r>
-        <w:rPr>
-          <w:sz w:val="22"/>
-          <w:szCs w:val="22"/>
-        </w:rPr>
-        <w:t xml:space="preserve">Option 3: Spectral — use the spectral dimension result HV-2a (d_s ≈ 3.24 at small scales) to connect the causal set geometry to the Minkowski manifold geometry.</w:t>
-      </w:r>
-    </w:p>
-    <w:p>
-      <w:pPr>
-        <w:spacing w:after="100"/>
-      </w:pPr>
-      <w:r>
-        <w:rPr>
-          <w:sz w:val="22"/>
-          <w:szCs w:val="22"/>
-        </w:rPr>
-        <w:t xml:space="preserve">Do not choose an option based on momentum. Assess which is most tractable from the primitives.</w:t>
+        <w:t xml:space="preserve">Priority 2 — Build the Complete Conjoined Master Document</w:t>
+      </w:r>
+    </w:p>
+    <w:p>
+      <w:pPr>
+        <w:spacing w:after="100"/>
+      </w:pPr>
+      <w:r>
+        <w:rPr>
+          <w:sz w:val="22"/>
+          <w:szCs w:val="22"/>
+        </w:rPr>
+        <w:t xml:space="preserve">The current master documents carry results forward from V17 but do not contain the complete derivation chains back to original conception. A complete single document is needed that contains:</w:t>
+      </w:r>
+    </w:p>
+    <w:p>
+      <w:pPr>
+        <w:spacing w:after="100"/>
+      </w:pPr>
+      <w:r>
+        <w:rPr>
+          <w:sz w:val="22"/>
+          <w:szCs w:val="22"/>
+        </w:rPr>
+        <w:t xml:space="preserve">(a) The original primitives stated precisely — A1, A2, A3, FP with full formal content.</w:t>
+      </w:r>
+    </w:p>
+    <w:p>
+      <w:pPr>
+        <w:spacing w:after="100"/>
+      </w:pPr>
+      <w:r>
+        <w:rPr>
+          <w:sz w:val="22"/>
+          <w:szCs w:val="22"/>
+        </w:rPr>
+        <w:t xml:space="preserve">(b) The complete V4 derivation sequence in order — composability forces exponential kernel, grading, k-chain homogeneity, Poisson form, d=4, τ=1, β=2π, β&gt;0, FP-minimal, PATH2-L1 through L3 — with actual derivation arguments at each step, not just results.</w:t>
+      </w:r>
+    </w:p>
+    <w:p>
+      <w:pPr>
+        <w:spacing w:after="100"/>
+      </w:pPr>
+      <w:r>
+        <w:rPr>
+          <w:sz w:val="22"/>
+          <w:szCs w:val="22"/>
+        </w:rPr>
+        <w:t xml:space="preserve">(c) The ruled-out paths with arguments — what was tried, what failed, why. These are as important as the positive results for external credibility.</w:t>
+      </w:r>
+    </w:p>
+    <w:p>
+      <w:pPr>
+        <w:spacing w:after="100"/>
+      </w:pPr>
+      <w:r>
+        <w:rPr>
+          <w:sz w:val="22"/>
+          <w:szCs w:val="22"/>
+        </w:rPr>
+        <w:t xml:space="preserve">(d) All identified results with conditionality precisely stated.</w:t>
+      </w:r>
+    </w:p>
+    <w:p>
+      <w:pPr>
+        <w:spacing w:after="100"/>
+      </w:pPr>
+      <w:r>
+        <w:rPr>
+          <w:sz w:val="22"/>
+          <w:szCs w:val="22"/>
+        </w:rPr>
+        <w:t xml:space="preserve">(e) All open paths with current status.</w:t>
+      </w:r>
+    </w:p>
+    <w:p>
+      <w:pPr>
+        <w:spacing w:after="100"/>
+      </w:pPr>
+      <w:r>
+        <w:rPr>
+          <w:sz w:val="22"/>
+          <w:szCs w:val="22"/>
+        </w:rPr>
+        <w:t xml:space="preserve">HOW TO BUILD IT: Read the historical masters from GitHub in sequence (V17 through V28) before writing. Some derivation sections will need to be reproduced from those earlier documents, not just summarized. Build it carefully — this document will be the definitive record for external engagement. Do not rush it.</w:t>
+      </w:r>
+    </w:p>
+    <w:p>
+      <w:pPr>
+        <w:spacing w:after="100"/>
+      </w:pPr>
+      <w:r>
+        <w:rPr>
+          <w:b/>
+          <w:bCs/>
+          <w:sz w:val="22"/>
+          <w:szCs w:val="22"/>
+        </w:rPr>
+        <w:t xml:space="preserve">This is the document that makes the program fully auditable from first principles to current state in one place. It is worth doing properly.</w:t>
       </w:r>
     </w:p>
     <w:p>
@@ -552,19 +542,108 @@
         <w:spacing w:after="80" w:before="240"/>
       </w:pPr>
       <w:r>
-        <w:t xml:space="preserve">Priority 3 — Volume 2 Dedicated Session</w:t>
-      </w:r>
-    </w:p>
-    <w:p>
-      <w:pPr>
-        <w:spacing w:after="100"/>
-      </w:pPr>
-      <w:r>
-        <w:rPr>
-          <w:sz w:val="22"/>
-          <w:szCs w:val="22"/>
-        </w:rPr>
-        <w:t xml:space="preserve">Architecture confirmed. Three movements mapped. Human weight of Purgatorio clarified. Begin actual sentences. Movement 1 opening: why something rather than nothing.</w:t>
+        <w:t xml:space="preserve">Priority 3 — HV: The Hauptvermutung</w:t>
+      </w:r>
+    </w:p>
+    <w:p>
+      <w:pPr>
+        <w:spacing w:after="100"/>
+      </w:pPr>
+      <w:r>
+        <w:rPr>
+          <w:sz w:val="22"/>
+          <w:szCs w:val="22"/>
+        </w:rPr>
+        <w:t xml:space="preserve">Primary mathematical target. HV requires showing V4's causal set IS the Minkowski Poisson sprinkling — equivalent in the full causal order sense, not just matching statistics.</w:t>
+      </w:r>
+    </w:p>
+    <w:p>
+      <w:pPr>
+        <w:spacing w:after="100"/>
+      </w:pPr>
+      <w:r>
+        <w:rPr>
+          <w:sz w:val="22"/>
+          <w:szCs w:val="22"/>
+        </w:rPr>
+        <w:t xml:space="preserve">Attempt fresh, without accumulated session momentum. Three approach options:</w:t>
+      </w:r>
+    </w:p>
+    <w:p>
+      <w:pPr>
+        <w:spacing w:after="100"/>
+      </w:pPr>
+      <w:r>
+        <w:rPr>
+          <w:sz w:val="22"/>
+          <w:szCs w:val="22"/>
+        </w:rPr>
+        <w:t xml:space="preserve">Option 1 (Constructive): show V4's partial order with all derived constraints admits a unique embedding in Minkowski up to diffeomorphism.</w:t>
+      </w:r>
+    </w:p>
+    <w:p>
+      <w:pPr>
+        <w:spacing w:after="100"/>
+      </w:pPr>
+      <w:r>
+        <w:rPr>
+          <w:sz w:val="22"/>
+          <w:szCs w:val="22"/>
+        </w:rPr>
+        <w:t xml:space="preserve">Option 2 (Completeness): show no causal set other than Minkowski Poisson sprinkling satisfies all V4 constraints simultaneously.</w:t>
+      </w:r>
+    </w:p>
+    <w:p>
+      <w:pPr>
+        <w:spacing w:after="100"/>
+      </w:pPr>
+      <w:r>
+        <w:rPr>
+          <w:sz w:val="22"/>
+          <w:szCs w:val="22"/>
+        </w:rPr>
+        <w:t xml:space="preserve">Option 3 (Spectral): use spectral dimension result HV-2a (d_s ≈ 3.24) to connect causal set geometry to Minkowski manifold geometry.</w:t>
+      </w:r>
+    </w:p>
+    <w:p>
+      <w:pPr>
+        <w:spacing w:after="100"/>
+      </w:pPr>
+      <w:r>
+        <w:rPr>
+          <w:sz w:val="22"/>
+          <w:szCs w:val="22"/>
+        </w:rPr>
+        <w:t xml:space="preserve">Assess which is most tractable from the primitives before committing to one. Do not choose based on momentum.</w:t>
+      </w:r>
+    </w:p>
+    <w:p>
+      <w:pPr>
+        <w:spacing w:after="80"/>
+      </w:pPr>
+      <w:r>
+        <w:t xml:space="preserve"/>
+      </w:r>
+    </w:p>
+    <w:p>
+      <w:pPr>
+        <w:pStyle w:val="Heading2"/>
+        <w:spacing w:after="80" w:before="240"/>
+      </w:pPr>
+      <w:r>
+        <w:t xml:space="preserve">Priority 4 — Volume 2 Dedicated Writing Session</w:t>
+      </w:r>
+    </w:p>
+    <w:p>
+      <w:pPr>
+        <w:spacing w:after="100"/>
+      </w:pPr>
+      <w:r>
+        <w:rPr>
+          <w:sz w:val="22"/>
+          <w:szCs w:val="22"/>
+        </w:rPr>
+        <w:t xml:space="preserve">Architecture confirmed. Three movements mapped. Begin actual sentences. Movement 1 opening: why something rather than nothing. The prologue is the model for register and tone.</w:t>
       </w:r>
     </w:p>
     <w:p>
@@ -637,7 +716,7 @@
           <w:sz w:val="22"/>
           <w:szCs w:val="22"/>
         </w:rPr>
-        <w:t xml:space="preserve">HV is hard. It has been open in CST since 1987. Attempt it honestly with full awareness that it may not close in one session or many.</w:t>
+        <w:t xml:space="preserve">HV is hard. It has been open in CST since 1987. Attempt it honestly knowing it may not close quickly.</w:t>
       </w:r>
     </w:p>
     <w:p>
@@ -651,7 +730,7 @@
           <w:sz w:val="22"/>
           <w:szCs w:val="22"/>
         </w:rPr>
-        <w:t xml:space="preserve">Do not let the momentum of prior sessions drive the HV argument. Start fresh from the gap.</w:t>
+        <w:t xml:space="preserve">The conjoined master is a documentation task, not a derivation task. Read the history before writing.</w:t>
       </w:r>
     </w:p>
     <w:p>
@@ -679,7 +758,7 @@
           <w:sz w:val="22"/>
           <w:szCs w:val="22"/>
         </w:rPr>
-        <w:t xml:space="preserve">The program is pre-publication, pre-validation. Genuine derived results exist. It is not yet a competitive physical theory. Both things are true simultaneously.</w:t>
+        <w:t xml:space="preserve">The program is pre-publication, pre-validation. Genuine derived results exist. It is not yet a competitive physical theory.</w:t>
       </w:r>
     </w:p>
     <w:p>
@@ -722,31 +801,31 @@
           <w:sz w:val="22"/>
           <w:szCs w:val="22"/>
         </w:rPr>
-        <w:t xml:space="preserve">This has been a long session across many hours. It produced real work: the full PATH 2 stress test, the Layer 3 chain probability result, and the 1/k! resolution. It also produced framing drift that was corrected within the session — those corrections are in the record.</w:t>
-      </w:r>
-    </w:p>
-    <w:p>
-      <w:pPr>
-        <w:spacing w:after="100"/>
-      </w:pPr>
-      <w:r>
-        <w:rPr>
-          <w:sz w:val="22"/>
-          <w:szCs w:val="22"/>
-        </w:rPr>
-        <w:t xml:space="preserve">The program is in good shape. PATH 2 is as complete as it can be without HV. The gaps are precisely located. The external review submission is ready pending one correction. Volume 2 has a sound architecture.</w:t>
-      </w:r>
-    </w:p>
-    <w:p>
-      <w:pPr>
-        <w:spacing w:after="100"/>
-      </w:pPr>
-      <w:r>
-        <w:rPr>
-          <w:sz w:val="22"/>
-          <w:szCs w:val="22"/>
-        </w:rPr>
-        <w:t xml:space="preserve">HV is what comes next. It deserves fresh attention, not the tail end of an exhausted session. The next session should open with the submission fix, then turn to HV with clear eyes.</w:t>
+        <w:t xml:space="preserve">V28 completed the full PATH 2 stress test and resolved the Layer 3 chain probability question. The program is in good shape. PATH 2 is as complete as it can be without HV. The gaps are precisely located.</w:t>
+      </w:r>
+    </w:p>
+    <w:p>
+      <w:pPr>
+        <w:spacing w:after="100"/>
+      </w:pPr>
+      <w:r>
+        <w:rPr>
+          <w:sz w:val="22"/>
+          <w:szCs w:val="22"/>
+        </w:rPr>
+        <w:t xml:space="preserve">The conjoined master document is the right next documentation step — it makes the program fully auditable from first principles to current state, which is what external engagement requires. It should be built from the historical record, carefully, before the external submission goes out.</w:t>
+      </w:r>
+    </w:p>
+    <w:p>
+      <w:pPr>
+        <w:spacing w:after="100"/>
+      </w:pPr>
+      <w:r>
+        <w:rPr>
+          <w:sz w:val="22"/>
+          <w:szCs w:val="22"/>
+        </w:rPr>
+        <w:t xml:space="preserve">HV is the mathematical frontier. The submission is ready pending one correction. Volume 2 is waiting for sentences.</w:t>
       </w:r>
     </w:p>
     <w:p>

</xml_diff>